<commit_message>
feat(docs): aggregate invoices into 1 single table row for warehouses without CO
</commit_message>
<xml_diff>
--- a/mau_form_chuan/QUYET_DINH_KHO_MEATFISH_T08_2026_MAU_CHUAN.docx
+++ b/mau_form_chuan/QUYET_DINH_KHO_MEATFISH_T08_2026_MAU_CHUAN.docx
@@ -72,7 +72,7 @@
               </w:rPr>
               <w:t>********</w:t>
               <w:br/>
-              <w:t>TPHCM, ngày 26 tháng 08 năm 2026</w:t>
+              <w:t>TPHCM, ngày 28 tháng 08 năm 2026</w:t>
             </w:r>
           </w:p>
         </w:tc>
@@ -364,7 +364,6 @@
               <w:left w:w="60" w:type="dxa"/>
               <w:right w:w="60" w:type="dxa"/>
             </w:tcMar>
-            <w:vMerge w:val="restart"/>
             <w:tcBorders>
               <w:top w:val="single" w:sz="6" w:color="000000"/>
               <w:left w:val="single" w:sz="6" w:color="000000"/>
@@ -399,7 +398,6 @@
               <w:left w:w="60" w:type="dxa"/>
               <w:right w:w="60" w:type="dxa"/>
             </w:tcMar>
-            <w:vMerge w:val="restart"/>
             <w:tcBorders>
               <w:top w:val="single" w:sz="6" w:color="000000"/>
               <w:left w:val="single" w:sz="6" w:color="000000"/>
@@ -453,7 +451,7 @@
                 <w:rFonts w:ascii="Times New Roman" w:hAnsi="Times New Roman"/>
                 <w:sz w:val="18"/>
               </w:rPr>
-              <w:t>(150)</w:t>
+              <w:t>(300)</w:t>
             </w:r>
           </w:p>
         </w:tc>
@@ -485,7 +483,7 @@
                 <w:rFonts w:ascii="Times New Roman" w:hAnsi="Times New Roman"/>
                 <w:sz w:val="18"/>
               </w:rPr>
-              <w:t>(15,000,000)</w:t>
+              <w:t>(30,000,000)</w:t>
             </w:r>
           </w:p>
         </w:tc>
@@ -517,7 +515,7 @@
                 <w:rFonts w:ascii="Times New Roman" w:hAnsi="Times New Roman"/>
                 <w:sz w:val="18"/>
               </w:rPr>
-              <w:t>(16,200,000)</w:t>
+              <w:t>(32,400,000)</w:t>
             </w:r>
           </w:p>
         </w:tc>
@@ -530,7 +528,6 @@
               <w:left w:w="60" w:type="dxa"/>
               <w:right w:w="60" w:type="dxa"/>
             </w:tcMar>
-            <w:vMerge w:val="restart"/>
             <w:tcBorders>
               <w:top w:val="single" w:sz="6" w:color="000000"/>
               <w:left w:val="single" w:sz="6" w:color="000000"/>
@@ -557,365 +554,6 @@
           </w:p>
         </w:tc>
       </w:tr>
-      <w:tr>
-        <w:tc>
-          <w:tcPr>
-            <w:tcW w:type="dxa" w:w="1152"/>
-            <w:tcMar>
-              <w:top w:w="50" w:type="dxa"/>
-              <w:bottom w:w="50" w:type="dxa"/>
-              <w:left w:w="60" w:type="dxa"/>
-              <w:right w:w="60" w:type="dxa"/>
-            </w:tcMar>
-            <w:vMerge/>
-            <w:tcBorders>
-              <w:top w:val="single" w:sz="6" w:color="000000"/>
-              <w:left w:val="single" w:sz="6" w:color="000000"/>
-              <w:bottom w:val="single" w:sz="6" w:color="000000"/>
-              <w:right w:val="single" w:sz="6" w:color="000000"/>
-              <w:insideH w:val="none"/>
-              <w:insideV w:val="none"/>
-            </w:tcBorders>
-          </w:tcPr>
-          <w:p/>
-        </w:tc>
-        <w:tc>
-          <w:tcPr>
-            <w:tcW w:type="dxa" w:w="2016"/>
-            <w:tcMar>
-              <w:top w:w="50" w:type="dxa"/>
-              <w:bottom w:w="50" w:type="dxa"/>
-              <w:left w:w="60" w:type="dxa"/>
-              <w:right w:w="60" w:type="dxa"/>
-            </w:tcMar>
-            <w:vMerge/>
-            <w:tcBorders>
-              <w:top w:val="single" w:sz="6" w:color="000000"/>
-              <w:left w:val="single" w:sz="6" w:color="000000"/>
-              <w:bottom w:val="single" w:sz="6" w:color="000000"/>
-              <w:right w:val="single" w:sz="6" w:color="000000"/>
-              <w:insideH w:val="none"/>
-              <w:insideV w:val="none"/>
-            </w:tcBorders>
-          </w:tcPr>
-          <w:p/>
-        </w:tc>
-        <w:tc>
-          <w:tcPr>
-            <w:tcW w:type="dxa" w:w="1440"/>
-            <w:tcMar>
-              <w:top w:w="50" w:type="dxa"/>
-              <w:bottom w:w="50" w:type="dxa"/>
-              <w:left w:w="60" w:type="dxa"/>
-              <w:right w:w="60" w:type="dxa"/>
-            </w:tcMar>
-            <w:tcBorders>
-              <w:top w:val="single" w:sz="6" w:color="000000"/>
-              <w:left w:val="single" w:sz="6" w:color="000000"/>
-              <w:bottom w:val="single" w:sz="6" w:color="000000"/>
-              <w:right w:val="single" w:sz="6" w:color="000000"/>
-              <w:insideH w:val="none"/>
-              <w:insideV w:val="none"/>
-            </w:tcBorders>
-          </w:tcPr>
-          <w:p>
-            <w:pPr>
-              <w:spacing w:line="276" w:lineRule="auto" w:before="40" w:after="40"/>
-              <w:jc w:val="right"/>
-            </w:pPr>
-            <w:r>
-              <w:rPr>
-                <w:rFonts w:ascii="Times New Roman" w:hAnsi="Times New Roman"/>
-                <w:sz w:val="18"/>
-              </w:rPr>
-              <w:t>(85)</w:t>
-            </w:r>
-          </w:p>
-        </w:tc>
-        <w:tc>
-          <w:tcPr>
-            <w:tcW w:type="dxa" w:w="1656"/>
-            <w:tcMar>
-              <w:top w:w="50" w:type="dxa"/>
-              <w:bottom w:w="50" w:type="dxa"/>
-              <w:left w:w="60" w:type="dxa"/>
-              <w:right w:w="60" w:type="dxa"/>
-            </w:tcMar>
-            <w:tcBorders>
-              <w:top w:val="single" w:sz="6" w:color="000000"/>
-              <w:left w:val="single" w:sz="6" w:color="000000"/>
-              <w:bottom w:val="single" w:sz="6" w:color="000000"/>
-              <w:right w:val="single" w:sz="6" w:color="000000"/>
-              <w:insideH w:val="none"/>
-              <w:insideV w:val="none"/>
-            </w:tcBorders>
-          </w:tcPr>
-          <w:p>
-            <w:pPr>
-              <w:spacing w:line="276" w:lineRule="auto" w:before="40" w:after="40"/>
-              <w:jc w:val="right"/>
-            </w:pPr>
-            <w:r>
-              <w:rPr>
-                <w:rFonts w:ascii="Times New Roman" w:hAnsi="Times New Roman"/>
-                <w:sz w:val="18"/>
-              </w:rPr>
-              <w:t>(8,500,000)</w:t>
-            </w:r>
-          </w:p>
-        </w:tc>
-        <w:tc>
-          <w:tcPr>
-            <w:tcW w:type="dxa" w:w="1656"/>
-            <w:tcMar>
-              <w:top w:w="50" w:type="dxa"/>
-              <w:bottom w:w="50" w:type="dxa"/>
-              <w:left w:w="60" w:type="dxa"/>
-              <w:right w:w="60" w:type="dxa"/>
-            </w:tcMar>
-            <w:tcBorders>
-              <w:top w:val="single" w:sz="6" w:color="000000"/>
-              <w:left w:val="single" w:sz="6" w:color="000000"/>
-              <w:bottom w:val="single" w:sz="6" w:color="000000"/>
-              <w:right w:val="single" w:sz="6" w:color="000000"/>
-              <w:insideH w:val="none"/>
-              <w:insideV w:val="none"/>
-            </w:tcBorders>
-          </w:tcPr>
-          <w:p>
-            <w:pPr>
-              <w:spacing w:line="276" w:lineRule="auto" w:before="40" w:after="40"/>
-              <w:jc w:val="right"/>
-            </w:pPr>
-            <w:r>
-              <w:rPr>
-                <w:rFonts w:ascii="Times New Roman" w:hAnsi="Times New Roman"/>
-                <w:sz w:val="18"/>
-              </w:rPr>
-              <w:t>(9,180,000)</w:t>
-            </w:r>
-          </w:p>
-        </w:tc>
-        <w:tc>
-          <w:tcPr>
-            <w:tcW w:type="dxa" w:w="1411"/>
-            <w:tcMar>
-              <w:top w:w="50" w:type="dxa"/>
-              <w:bottom w:w="50" w:type="dxa"/>
-              <w:left w:w="60" w:type="dxa"/>
-              <w:right w:w="60" w:type="dxa"/>
-            </w:tcMar>
-            <w:vMerge/>
-            <w:tcBorders>
-              <w:top w:val="single" w:sz="6" w:color="000000"/>
-              <w:left w:val="single" w:sz="6" w:color="000000"/>
-              <w:bottom w:val="single" w:sz="6" w:color="000000"/>
-              <w:right w:val="single" w:sz="6" w:color="000000"/>
-              <w:insideH w:val="none"/>
-              <w:insideV w:val="none"/>
-            </w:tcBorders>
-          </w:tcPr>
-          <w:p/>
-        </w:tc>
-      </w:tr>
-      <w:tr>
-        <w:tc>
-          <w:tcPr>
-            <w:tcW w:type="dxa" w:w="1152"/>
-            <w:tcMar>
-              <w:top w:w="60" w:type="dxa"/>
-              <w:bottom w:w="60" w:type="dxa"/>
-              <w:left w:w="60" w:type="dxa"/>
-              <w:right w:w="60" w:type="dxa"/>
-            </w:tcMar>
-            <w:tcBorders>
-              <w:top w:val="single" w:sz="6" w:color="000000"/>
-              <w:left w:val="single" w:sz="6" w:color="000000"/>
-              <w:bottom w:val="single" w:sz="6" w:color="000000"/>
-              <w:right w:val="single" w:sz="6" w:color="000000"/>
-              <w:insideH w:val="none"/>
-              <w:insideV w:val="none"/>
-            </w:tcBorders>
-          </w:tcPr>
-          <w:p>
-            <w:pPr>
-              <w:spacing w:line="276" w:lineRule="auto" w:before="40" w:after="40"/>
-              <w:jc w:val="center"/>
-            </w:pPr>
-            <w:r>
-              <w:rPr>
-                <w:rFonts w:ascii="Times New Roman" w:hAnsi="Times New Roman"/>
-                <w:b/>
-                <w:sz w:val="19"/>
-              </w:rPr>
-            </w:r>
-          </w:p>
-        </w:tc>
-        <w:tc>
-          <w:tcPr>
-            <w:tcW w:type="dxa" w:w="2016"/>
-            <w:tcMar>
-              <w:top w:w="60" w:type="dxa"/>
-              <w:bottom w:w="60" w:type="dxa"/>
-              <w:left w:w="60" w:type="dxa"/>
-              <w:right w:w="60" w:type="dxa"/>
-            </w:tcMar>
-            <w:tcBorders>
-              <w:top w:val="single" w:sz="6" w:color="000000"/>
-              <w:left w:val="single" w:sz="6" w:color="000000"/>
-              <w:bottom w:val="single" w:sz="6" w:color="000000"/>
-              <w:right w:val="single" w:sz="6" w:color="000000"/>
-              <w:insideH w:val="none"/>
-              <w:insideV w:val="none"/>
-            </w:tcBorders>
-          </w:tcPr>
-          <w:p>
-            <w:pPr>
-              <w:spacing w:line="276" w:lineRule="auto" w:before="40" w:after="40"/>
-              <w:jc w:val="left"/>
-            </w:pPr>
-            <w:r>
-              <w:rPr>
-                <w:rFonts w:ascii="Times New Roman" w:hAnsi="Times New Roman"/>
-                <w:b/>
-                <w:sz w:val="19"/>
-              </w:rPr>
-              <w:t>Grand Total</w:t>
-            </w:r>
-          </w:p>
-        </w:tc>
-        <w:tc>
-          <w:tcPr>
-            <w:tcW w:type="dxa" w:w="1440"/>
-            <w:tcMar>
-              <w:top w:w="60" w:type="dxa"/>
-              <w:bottom w:w="60" w:type="dxa"/>
-              <w:left w:w="60" w:type="dxa"/>
-              <w:right w:w="60" w:type="dxa"/>
-            </w:tcMar>
-            <w:tcBorders>
-              <w:top w:val="single" w:sz="6" w:color="000000"/>
-              <w:left w:val="single" w:sz="6" w:color="000000"/>
-              <w:bottom w:val="single" w:sz="6" w:color="000000"/>
-              <w:right w:val="single" w:sz="6" w:color="000000"/>
-              <w:insideH w:val="none"/>
-              <w:insideV w:val="none"/>
-            </w:tcBorders>
-          </w:tcPr>
-          <w:p>
-            <w:pPr>
-              <w:spacing w:line="276" w:lineRule="auto" w:before="40" w:after="40"/>
-              <w:jc w:val="right"/>
-            </w:pPr>
-            <w:r>
-              <w:rPr>
-                <w:rFonts w:ascii="Times New Roman" w:hAnsi="Times New Roman"/>
-                <w:b/>
-                <w:sz w:val="19"/>
-              </w:rPr>
-              <w:t>(235)</w:t>
-            </w:r>
-          </w:p>
-        </w:tc>
-        <w:tc>
-          <w:tcPr>
-            <w:tcW w:type="dxa" w:w="1656"/>
-            <w:tcMar>
-              <w:top w:w="60" w:type="dxa"/>
-              <w:bottom w:w="60" w:type="dxa"/>
-              <w:left w:w="60" w:type="dxa"/>
-              <w:right w:w="60" w:type="dxa"/>
-            </w:tcMar>
-            <w:tcBorders>
-              <w:top w:val="single" w:sz="6" w:color="000000"/>
-              <w:left w:val="single" w:sz="6" w:color="000000"/>
-              <w:bottom w:val="single" w:sz="6" w:color="000000"/>
-              <w:right w:val="single" w:sz="6" w:color="000000"/>
-              <w:insideH w:val="none"/>
-              <w:insideV w:val="none"/>
-            </w:tcBorders>
-          </w:tcPr>
-          <w:p>
-            <w:pPr>
-              <w:spacing w:line="276" w:lineRule="auto" w:before="40" w:after="40"/>
-              <w:jc w:val="right"/>
-            </w:pPr>
-            <w:r>
-              <w:rPr>
-                <w:rFonts w:ascii="Times New Roman" w:hAnsi="Times New Roman"/>
-                <w:b/>
-                <w:sz w:val="19"/>
-              </w:rPr>
-              <w:t>(23,500,000)</w:t>
-            </w:r>
-          </w:p>
-        </w:tc>
-        <w:tc>
-          <w:tcPr>
-            <w:tcW w:type="dxa" w:w="1656"/>
-            <w:tcMar>
-              <w:top w:w="60" w:type="dxa"/>
-              <w:bottom w:w="60" w:type="dxa"/>
-              <w:left w:w="60" w:type="dxa"/>
-              <w:right w:w="60" w:type="dxa"/>
-            </w:tcMar>
-            <w:tcBorders>
-              <w:top w:val="single" w:sz="6" w:color="000000"/>
-              <w:left w:val="single" w:sz="6" w:color="000000"/>
-              <w:bottom w:val="single" w:sz="6" w:color="000000"/>
-              <w:right w:val="single" w:sz="6" w:color="000000"/>
-              <w:insideH w:val="none"/>
-              <w:insideV w:val="none"/>
-            </w:tcBorders>
-          </w:tcPr>
-          <w:p>
-            <w:pPr>
-              <w:spacing w:line="276" w:lineRule="auto" w:before="40" w:after="40"/>
-              <w:jc w:val="right"/>
-            </w:pPr>
-            <w:r>
-              <w:rPr>
-                <w:rFonts w:ascii="Times New Roman" w:hAnsi="Times New Roman"/>
-                <w:b/>
-                <w:sz w:val="19"/>
-              </w:rPr>
-              <w:t>(25,380,000)</w:t>
-            </w:r>
-          </w:p>
-        </w:tc>
-        <w:tc>
-          <w:tcPr>
-            <w:tcW w:type="dxa" w:w="1411"/>
-            <w:tcMar>
-              <w:top w:w="60" w:type="dxa"/>
-              <w:bottom w:w="60" w:type="dxa"/>
-              <w:left w:w="60" w:type="dxa"/>
-              <w:right w:w="60" w:type="dxa"/>
-            </w:tcMar>
-            <w:tcBorders>
-              <w:top w:val="single" w:sz="6" w:color="000000"/>
-              <w:left w:val="single" w:sz="6" w:color="000000"/>
-              <w:bottom w:val="single" w:sz="6" w:color="000000"/>
-              <w:right w:val="single" w:sz="6" w:color="000000"/>
-              <w:insideH w:val="none"/>
-              <w:insideV w:val="none"/>
-            </w:tcBorders>
-          </w:tcPr>
-          <w:p>
-            <w:pPr>
-              <w:spacing w:line="276" w:lineRule="auto" w:before="40" w:after="40"/>
-              <w:jc w:val="center"/>
-            </w:pPr>
-            <w:r>
-              <w:rPr>
-                <w:rFonts w:ascii="Times New Roman" w:hAnsi="Times New Roman"/>
-                <w:b/>
-                <w:sz w:val="19"/>
-              </w:rPr>
-            </w:r>
-          </w:p>
-        </w:tc>
-      </w:tr>
     </w:tbl>
     <w:p>
       <w:pPr>
@@ -935,7 +573,7 @@
           <w:b/>
           <w:sz w:val="21"/>
         </w:rPr>
-        <w:t>25,380,000 VNĐ</w:t>
+        <w:t>32,400,000 VNĐ</w:t>
         <w:br/>
       </w:r>
       <w:r>
@@ -943,11 +581,18 @@
           <w:rFonts w:ascii="Times New Roman" w:hAnsi="Times New Roman"/>
           <w:sz w:val="21"/>
         </w:rPr>
-        <w:t>- Tổng giá trị chênh lệch kho: (23,500,000) VNĐ (Chưa VAT)</w:t>
+        <w:t>- Tổng giá trị chênh lệch kho: (30,000,000) VNĐ (Chưa VAT)</w:t>
         <w:br/>
         <w:t>- Tỷ lệ quy trách nhiệm: DC (SCF) chịu 100% giá trị.</w:t>
         <w:br/>
-        <w:t>(Bằng chữ: Hai mươi lăm triệu ba trăm tám mươi nghìn đồng)</w:t>
+      </w:r>
+      <w:r>
+        <w:rPr>
+          <w:rFonts w:ascii="Times New Roman" w:hAnsi="Times New Roman"/>
+          <w:i/>
+          <w:sz w:val="21"/>
+        </w:rPr>
+        <w:t>(Bằng chữ: Ba mươi hai triệu bốn trăm nghìn đồng)</w:t>
       </w:r>
     </w:p>
     <w:p>

</xml_diff>